<commit_message>
rebuilding the virtual datacenter - ADDS DNS used for az-migrate appliance - ubuntu machines use Azure DNS directly - VM-DC also installs MARS and ASR agents/services
</commit_message>
<xml_diff>
--- a/workshop/workshop.docx
+++ b/workshop/workshop.docx
@@ -30,6 +30,7 @@
       </w:pPr>
       <w:r>
         <w:rPr>
+          <w:noProof/>
           <w:lang w:val="en-US"/>
         </w:rPr>
         <w:drawing>
@@ -90,6 +91,7 @@
       </w:pPr>
       <w:r>
         <w:rPr>
+          <w:noProof/>
           <w:lang w:val="en-US"/>
         </w:rPr>
         <w:drawing>
@@ -150,6 +152,7 @@
       </w:pPr>
       <w:r>
         <w:rPr>
+          <w:noProof/>
           <w:lang w:val="en-US"/>
         </w:rPr>
         <w:drawing>
@@ -230,6 +233,7 @@
       </w:r>
       <w:r>
         <w:rPr>
+          <w:noProof/>
           <w:lang w:val="en-US"/>
         </w:rPr>
         <w:drawing>
@@ -297,6 +301,7 @@
       </w:pPr>
       <w:r>
         <w:rPr>
+          <w:noProof/>
           <w:lang w:val="en-US"/>
         </w:rPr>
         <w:drawing>
@@ -377,6 +382,7 @@
       </w:pPr>
       <w:r>
         <w:rPr>
+          <w:noProof/>
           <w:lang w:val="en-US"/>
         </w:rPr>
         <w:drawing>
@@ -438,6 +444,7 @@
       </w:pPr>
       <w:r>
         <w:rPr>
+          <w:noProof/>
           <w:lang w:val="en-US"/>
         </w:rPr>
         <w:drawing>
@@ -505,6 +512,7 @@
       </w:pPr>
       <w:r>
         <w:rPr>
+          <w:noProof/>
           <w:lang w:val="en-US"/>
         </w:rPr>
         <w:drawing>
@@ -604,6 +612,7 @@
       </w:pPr>
       <w:r>
         <w:rPr>
+          <w:noProof/>
           <w:lang w:val="en-US"/>
         </w:rPr>
         <w:drawing>
@@ -664,6 +673,7 @@
       </w:pPr>
       <w:r>
         <w:rPr>
+          <w:noProof/>
           <w:lang w:val="en-US"/>
         </w:rPr>
         <w:drawing>
@@ -711,6 +721,7 @@
       </w:pPr>
       <w:r>
         <w:rPr>
+          <w:noProof/>
           <w:lang w:val="en-US"/>
         </w:rPr>
         <w:drawing>
@@ -798,6 +809,7 @@
       </w:pPr>
       <w:r>
         <w:rPr>
+          <w:noProof/>
           <w:lang w:val="en-US"/>
         </w:rPr>
         <w:lastRenderedPageBreak/>
@@ -846,6 +858,7 @@
       </w:pPr>
       <w:r>
         <w:rPr>
+          <w:noProof/>
           <w:lang w:val="en-US"/>
         </w:rPr>
         <w:drawing>
@@ -913,6 +926,7 @@
       </w:pPr>
       <w:r>
         <w:rPr>
+          <w:noProof/>
           <w:lang w:val="en-US"/>
         </w:rPr>
         <w:drawing>
@@ -1007,6 +1021,7 @@
       </w:pPr>
       <w:r>
         <w:rPr>
+          <w:noProof/>
           <w:lang w:val="en-US"/>
         </w:rPr>
         <w:lastRenderedPageBreak/>
@@ -1057,17 +1072,30 @@
         <w:rPr>
           <w:lang w:val="en-US"/>
         </w:rPr>
-        <w:t>Hit “Discovered Servers” -&gt; Disvoer</w:t>
-      </w:r>
-    </w:p>
-    <w:p>
-      <w:pPr>
-        <w:rPr>
-          <w:lang w:val="en-US"/>
-        </w:rPr>
-      </w:pPr>
-      <w:r>
-        <w:rPr>
+        <w:t>Hit “Discovered Servers” -&gt; Dis</w:t>
+      </w:r>
+      <w:r>
+        <w:rPr>
+          <w:lang w:val="en-US"/>
+        </w:rPr>
+        <w:t>cov</w:t>
+      </w:r>
+      <w:r>
+        <w:rPr>
+          <w:lang w:val="en-US"/>
+        </w:rPr>
+        <w:t>er</w:t>
+      </w:r>
+    </w:p>
+    <w:p>
+      <w:pPr>
+        <w:rPr>
+          <w:lang w:val="en-US"/>
+        </w:rPr>
+      </w:pPr>
+      <w:r>
+        <w:rPr>
+          <w:noProof/>
           <w:lang w:val="en-US"/>
         </w:rPr>
         <w:drawing>
@@ -1135,6 +1163,7 @@
       </w:pPr>
       <w:r>
         <w:rPr>
+          <w:noProof/>
           <w:lang w:val="en-US"/>
         </w:rPr>
         <w:drawing>
@@ -1222,6 +1251,7 @@
       </w:pPr>
       <w:r>
         <w:rPr>
+          <w:noProof/>
           <w:lang w:val="en-US"/>
         </w:rPr>
         <w:drawing>
@@ -1274,6 +1304,459 @@
           <w:lang w:val="en-US"/>
         </w:rPr>
       </w:pPr>
+      <w:r>
+        <w:rPr>
+          <w:lang w:val="en-US"/>
+        </w:rPr>
+        <w:br/>
+      </w:r>
+    </w:p>
+    <w:p>
+      <w:pPr>
+        <w:rPr>
+          <w:lang w:val="en-US"/>
+        </w:rPr>
+      </w:pPr>
+      <w:r>
+        <w:rPr>
+          <w:lang w:val="en-US"/>
+        </w:rPr>
+        <w:br w:type="page"/>
+      </w:r>
+    </w:p>
+    <w:p>
+      <w:pPr>
+        <w:rPr>
+          <w:lang w:val="en-US"/>
+        </w:rPr>
+      </w:pPr>
+      <w:r>
+        <w:rPr>
+          <w:lang w:val="en-US"/>
+        </w:rPr>
+        <w:lastRenderedPageBreak/>
+        <w:t>After Finalize Registration</w:t>
+      </w:r>
+    </w:p>
+    <w:p>
+      <w:pPr>
+        <w:rPr>
+          <w:lang w:val="en-US"/>
+        </w:rPr>
+      </w:pPr>
+      <w:r>
+        <w:rPr>
+          <w:lang w:val="en-US"/>
+        </w:rPr>
+        <w:t>Hit Start Execution</w:t>
+      </w:r>
+    </w:p>
+    <w:p>
+      <w:pPr>
+        <w:rPr>
+          <w:lang w:val="en-US"/>
+        </w:rPr>
+      </w:pPr>
+      <w:r>
+        <w:rPr>
+          <w:lang w:val="en-US"/>
+        </w:rPr>
+        <w:drawing>
+          <wp:inline distT="0" distB="0" distL="0" distR="0" wp14:anchorId="01656AB4" wp14:editId="0493ED40">
+            <wp:extent cx="5731510" cy="2673350"/>
+            <wp:effectExtent l="0" t="0" r="2540" b="0"/>
+            <wp:docPr id="1522503938" name="Picture 1"/>
+            <wp:cNvGraphicFramePr>
+              <a:graphicFrameLocks xmlns:a="http://schemas.openxmlformats.org/drawingml/2006/main" noChangeAspect="1"/>
+            </wp:cNvGraphicFramePr>
+            <a:graphic xmlns:a="http://schemas.openxmlformats.org/drawingml/2006/main">
+              <a:graphicData uri="http://schemas.openxmlformats.org/drawingml/2006/picture">
+                <pic:pic xmlns:pic="http://schemas.openxmlformats.org/drawingml/2006/picture">
+                  <pic:nvPicPr>
+                    <pic:cNvPr id="1522503938" name=""/>
+                    <pic:cNvPicPr/>
+                  </pic:nvPicPr>
+                  <pic:blipFill>
+                    <a:blip r:embed="rId22"/>
+                    <a:stretch>
+                      <a:fillRect/>
+                    </a:stretch>
+                  </pic:blipFill>
+                  <pic:spPr>
+                    <a:xfrm>
+                      <a:off x="0" y="0"/>
+                      <a:ext cx="5731510" cy="2673350"/>
+                    </a:xfrm>
+                    <a:prstGeom prst="rect">
+                      <a:avLst/>
+                    </a:prstGeom>
+                  </pic:spPr>
+                </pic:pic>
+              </a:graphicData>
+            </a:graphic>
+          </wp:inline>
+        </w:drawing>
+      </w:r>
+    </w:p>
+    <w:p>
+      <w:pPr>
+        <w:rPr>
+          <w:lang w:val="en-US"/>
+        </w:rPr>
+      </w:pPr>
+    </w:p>
+    <w:p>
+      <w:pPr>
+        <w:rPr>
+          <w:lang w:val="en-US"/>
+        </w:rPr>
+      </w:pPr>
+      <w:r>
+        <w:rPr>
+          <w:lang w:val="en-US"/>
+        </w:rPr>
+        <w:lastRenderedPageBreak/>
+        <w:drawing>
+          <wp:inline distT="0" distB="0" distL="0" distR="0" wp14:anchorId="06964B60" wp14:editId="68456C80">
+            <wp:extent cx="5731510" cy="5321935"/>
+            <wp:effectExtent l="0" t="0" r="2540" b="0"/>
+            <wp:docPr id="53039349" name="Picture 1"/>
+            <wp:cNvGraphicFramePr>
+              <a:graphicFrameLocks xmlns:a="http://schemas.openxmlformats.org/drawingml/2006/main" noChangeAspect="1"/>
+            </wp:cNvGraphicFramePr>
+            <a:graphic xmlns:a="http://schemas.openxmlformats.org/drawingml/2006/main">
+              <a:graphicData uri="http://schemas.openxmlformats.org/drawingml/2006/picture">
+                <pic:pic xmlns:pic="http://schemas.openxmlformats.org/drawingml/2006/picture">
+                  <pic:nvPicPr>
+                    <pic:cNvPr id="53039349" name=""/>
+                    <pic:cNvPicPr/>
+                  </pic:nvPicPr>
+                  <pic:blipFill>
+                    <a:blip r:embed="rId23"/>
+                    <a:stretch>
+                      <a:fillRect/>
+                    </a:stretch>
+                  </pic:blipFill>
+                  <pic:spPr>
+                    <a:xfrm>
+                      <a:off x="0" y="0"/>
+                      <a:ext cx="5731510" cy="5321935"/>
+                    </a:xfrm>
+                    <a:prstGeom prst="rect">
+                      <a:avLst/>
+                    </a:prstGeom>
+                  </pic:spPr>
+                </pic:pic>
+              </a:graphicData>
+            </a:graphic>
+          </wp:inline>
+        </w:drawing>
+      </w:r>
+      <w:r>
+        <w:rPr>
+          <w:lang w:val="en-US"/>
+        </w:rPr>
+        <w:br/>
+      </w:r>
+      <w:r>
+        <w:rPr>
+          <w:lang w:val="en-US"/>
+        </w:rPr>
+        <w:br/>
+        <w:t>select the assessment and the HyperV migration appliance -&gt; choose continue</w:t>
+      </w:r>
+    </w:p>
+    <w:p>
+      <w:pPr>
+        <w:rPr>
+          <w:lang w:val="en-US"/>
+        </w:rPr>
+      </w:pPr>
+    </w:p>
+    <w:p>
+      <w:pPr>
+        <w:rPr>
+          <w:lang w:val="en-US"/>
+        </w:rPr>
+      </w:pPr>
+      <w:r>
+        <w:rPr>
+          <w:lang w:val="en-US"/>
+        </w:rPr>
+        <w:br w:type="page"/>
+      </w:r>
+    </w:p>
+    <w:p>
+      <w:pPr>
+        <w:rPr>
+          <w:lang w:val="en-US"/>
+        </w:rPr>
+      </w:pPr>
+      <w:r>
+        <w:rPr>
+          <w:lang w:val="en-US"/>
+        </w:rPr>
+        <w:lastRenderedPageBreak/>
+        <w:t>Select workloads (machines)</w:t>
+      </w:r>
+    </w:p>
+    <w:p>
+      <w:pPr>
+        <w:rPr>
+          <w:lang w:val="en-US"/>
+        </w:rPr>
+      </w:pPr>
+      <w:r>
+        <w:rPr>
+          <w:lang w:val="en-US"/>
+        </w:rPr>
+        <w:drawing>
+          <wp:inline distT="0" distB="0" distL="0" distR="0" wp14:anchorId="50C2A495" wp14:editId="30119722">
+            <wp:extent cx="5731510" cy="3336925"/>
+            <wp:effectExtent l="0" t="0" r="2540" b="0"/>
+            <wp:docPr id="1228115586" name="Picture 1"/>
+            <wp:cNvGraphicFramePr>
+              <a:graphicFrameLocks xmlns:a="http://schemas.openxmlformats.org/drawingml/2006/main" noChangeAspect="1"/>
+            </wp:cNvGraphicFramePr>
+            <a:graphic xmlns:a="http://schemas.openxmlformats.org/drawingml/2006/main">
+              <a:graphicData uri="http://schemas.openxmlformats.org/drawingml/2006/picture">
+                <pic:pic xmlns:pic="http://schemas.openxmlformats.org/drawingml/2006/picture">
+                  <pic:nvPicPr>
+                    <pic:cNvPr id="1228115586" name=""/>
+                    <pic:cNvPicPr/>
+                  </pic:nvPicPr>
+                  <pic:blipFill>
+                    <a:blip r:embed="rId24"/>
+                    <a:stretch>
+                      <a:fillRect/>
+                    </a:stretch>
+                  </pic:blipFill>
+                  <pic:spPr>
+                    <a:xfrm>
+                      <a:off x="0" y="0"/>
+                      <a:ext cx="5731510" cy="3336925"/>
+                    </a:xfrm>
+                    <a:prstGeom prst="rect">
+                      <a:avLst/>
+                    </a:prstGeom>
+                  </pic:spPr>
+                </pic:pic>
+              </a:graphicData>
+            </a:graphic>
+          </wp:inline>
+        </w:drawing>
+      </w:r>
+    </w:p>
+    <w:p>
+      <w:pPr>
+        <w:rPr>
+          <w:lang w:val="en-US"/>
+        </w:rPr>
+      </w:pPr>
+    </w:p>
+    <w:p>
+      <w:pPr>
+        <w:rPr>
+          <w:lang w:val="en-US"/>
+        </w:rPr>
+      </w:pPr>
+      <w:r>
+        <w:rPr>
+          <w:lang w:val="en-US"/>
+        </w:rPr>
+        <w:drawing>
+          <wp:inline distT="0" distB="0" distL="0" distR="0" wp14:anchorId="54457AC3" wp14:editId="1FDC323C">
+            <wp:extent cx="5731510" cy="4305300"/>
+            <wp:effectExtent l="0" t="0" r="2540" b="0"/>
+            <wp:docPr id="1923906925" name="Picture 1"/>
+            <wp:cNvGraphicFramePr>
+              <a:graphicFrameLocks xmlns:a="http://schemas.openxmlformats.org/drawingml/2006/main" noChangeAspect="1"/>
+            </wp:cNvGraphicFramePr>
+            <a:graphic xmlns:a="http://schemas.openxmlformats.org/drawingml/2006/main">
+              <a:graphicData uri="http://schemas.openxmlformats.org/drawingml/2006/picture">
+                <pic:pic xmlns:pic="http://schemas.openxmlformats.org/drawingml/2006/picture">
+                  <pic:nvPicPr>
+                    <pic:cNvPr id="1923906925" name=""/>
+                    <pic:cNvPicPr/>
+                  </pic:nvPicPr>
+                  <pic:blipFill>
+                    <a:blip r:embed="rId25"/>
+                    <a:stretch>
+                      <a:fillRect/>
+                    </a:stretch>
+                  </pic:blipFill>
+                  <pic:spPr>
+                    <a:xfrm>
+                      <a:off x="0" y="0"/>
+                      <a:ext cx="5731510" cy="4305300"/>
+                    </a:xfrm>
+                    <a:prstGeom prst="rect">
+                      <a:avLst/>
+                    </a:prstGeom>
+                  </pic:spPr>
+                </pic:pic>
+              </a:graphicData>
+            </a:graphic>
+          </wp:inline>
+        </w:drawing>
+      </w:r>
+    </w:p>
+    <w:p>
+      <w:pPr>
+        <w:rPr>
+          <w:lang w:val="en-US"/>
+        </w:rPr>
+      </w:pPr>
+      <w:r>
+        <w:rPr>
+          <w:lang w:val="en-US"/>
+        </w:rPr>
+        <w:lastRenderedPageBreak/>
+        <w:drawing>
+          <wp:inline distT="0" distB="0" distL="0" distR="0" wp14:anchorId="4A180062" wp14:editId="39C31512">
+            <wp:extent cx="5731510" cy="1637665"/>
+            <wp:effectExtent l="0" t="0" r="2540" b="635"/>
+            <wp:docPr id="797019552" name="Picture 1"/>
+            <wp:cNvGraphicFramePr>
+              <a:graphicFrameLocks xmlns:a="http://schemas.openxmlformats.org/drawingml/2006/main" noChangeAspect="1"/>
+            </wp:cNvGraphicFramePr>
+            <a:graphic xmlns:a="http://schemas.openxmlformats.org/drawingml/2006/main">
+              <a:graphicData uri="http://schemas.openxmlformats.org/drawingml/2006/picture">
+                <pic:pic xmlns:pic="http://schemas.openxmlformats.org/drawingml/2006/picture">
+                  <pic:nvPicPr>
+                    <pic:cNvPr id="797019552" name=""/>
+                    <pic:cNvPicPr/>
+                  </pic:nvPicPr>
+                  <pic:blipFill>
+                    <a:blip r:embed="rId26"/>
+                    <a:stretch>
+                      <a:fillRect/>
+                    </a:stretch>
+                  </pic:blipFill>
+                  <pic:spPr>
+                    <a:xfrm>
+                      <a:off x="0" y="0"/>
+                      <a:ext cx="5731510" cy="1637665"/>
+                    </a:xfrm>
+                    <a:prstGeom prst="rect">
+                      <a:avLst/>
+                    </a:prstGeom>
+                  </pic:spPr>
+                </pic:pic>
+              </a:graphicData>
+            </a:graphic>
+          </wp:inline>
+        </w:drawing>
+      </w:r>
+    </w:p>
+    <w:p>
+      <w:pPr>
+        <w:rPr>
+          <w:lang w:val="en-US"/>
+        </w:rPr>
+      </w:pPr>
+    </w:p>
+    <w:p>
+      <w:pPr>
+        <w:rPr>
+          <w:lang w:val="en-US"/>
+        </w:rPr>
+      </w:pPr>
+      <w:r>
+        <w:rPr>
+          <w:lang w:val="en-US"/>
+        </w:rPr>
+        <w:drawing>
+          <wp:inline distT="0" distB="0" distL="0" distR="0" wp14:anchorId="77F4EB94" wp14:editId="48C1A8E2">
+            <wp:extent cx="5731510" cy="1414145"/>
+            <wp:effectExtent l="0" t="0" r="2540" b="0"/>
+            <wp:docPr id="1787956542" name="Picture 1"/>
+            <wp:cNvGraphicFramePr>
+              <a:graphicFrameLocks xmlns:a="http://schemas.openxmlformats.org/drawingml/2006/main" noChangeAspect="1"/>
+            </wp:cNvGraphicFramePr>
+            <a:graphic xmlns:a="http://schemas.openxmlformats.org/drawingml/2006/main">
+              <a:graphicData uri="http://schemas.openxmlformats.org/drawingml/2006/picture">
+                <pic:pic xmlns:pic="http://schemas.openxmlformats.org/drawingml/2006/picture">
+                  <pic:nvPicPr>
+                    <pic:cNvPr id="1787956542" name=""/>
+                    <pic:cNvPicPr/>
+                  </pic:nvPicPr>
+                  <pic:blipFill>
+                    <a:blip r:embed="rId27"/>
+                    <a:stretch>
+                      <a:fillRect/>
+                    </a:stretch>
+                  </pic:blipFill>
+                  <pic:spPr>
+                    <a:xfrm>
+                      <a:off x="0" y="0"/>
+                      <a:ext cx="5731510" cy="1414145"/>
+                    </a:xfrm>
+                    <a:prstGeom prst="rect">
+                      <a:avLst/>
+                    </a:prstGeom>
+                  </pic:spPr>
+                </pic:pic>
+              </a:graphicData>
+            </a:graphic>
+          </wp:inline>
+        </w:drawing>
+      </w:r>
+    </w:p>
+    <w:p>
+      <w:pPr>
+        <w:rPr>
+          <w:lang w:val="en-US"/>
+        </w:rPr>
+      </w:pPr>
+    </w:p>
+    <w:p>
+      <w:pPr>
+        <w:rPr>
+          <w:lang w:val="en-US"/>
+        </w:rPr>
+      </w:pPr>
+      <w:r>
+        <w:rPr>
+          <w:lang w:val="en-US"/>
+        </w:rPr>
+        <w:lastRenderedPageBreak/>
+        <w:drawing>
+          <wp:inline distT="0" distB="0" distL="0" distR="0" wp14:anchorId="14ED4218" wp14:editId="144CFDB9">
+            <wp:extent cx="5731510" cy="5441950"/>
+            <wp:effectExtent l="0" t="0" r="2540" b="6350"/>
+            <wp:docPr id="1218949630" name="Picture 1"/>
+            <wp:cNvGraphicFramePr>
+              <a:graphicFrameLocks xmlns:a="http://schemas.openxmlformats.org/drawingml/2006/main" noChangeAspect="1"/>
+            </wp:cNvGraphicFramePr>
+            <a:graphic xmlns:a="http://schemas.openxmlformats.org/drawingml/2006/main">
+              <a:graphicData uri="http://schemas.openxmlformats.org/drawingml/2006/picture">
+                <pic:pic xmlns:pic="http://schemas.openxmlformats.org/drawingml/2006/picture">
+                  <pic:nvPicPr>
+                    <pic:cNvPr id="1218949630" name=""/>
+                    <pic:cNvPicPr/>
+                  </pic:nvPicPr>
+                  <pic:blipFill>
+                    <a:blip r:embed="rId28"/>
+                    <a:stretch>
+                      <a:fillRect/>
+                    </a:stretch>
+                  </pic:blipFill>
+                  <pic:spPr>
+                    <a:xfrm>
+                      <a:off x="0" y="0"/>
+                      <a:ext cx="5731510" cy="5441950"/>
+                    </a:xfrm>
+                    <a:prstGeom prst="rect">
+                      <a:avLst/>
+                    </a:prstGeom>
+                  </pic:spPr>
+                </pic:pic>
+              </a:graphicData>
+            </a:graphic>
+          </wp:inline>
+        </w:drawing>
+      </w:r>
     </w:p>
     <w:p>
       <w:pPr>

</xml_diff>